<commit_message>
Add written conclusions to all 11 Machine Vision practicals
Replaced the generic 'Students should...' prompts with a proper 3-4 line
conclusion for each practical, tailored to that experiment's results.
Regenerated the filled manual (docx + PDF) and the duplex print-ready PDF
(each practical still starts on a front/odd page).

Co-Authored-By: Claude Opus 4.8 <noreply@anthropic.com>
Claude-Session: https://claude.ai/code/session_01REYoacDfMmcfn4tpcBCmyb
</commit_message>
<xml_diff>
--- a/PBL_AM/MachineVision_Lab/Machine_Vision_Lab_Manual_FILLED.docx
+++ b/PBL_AM/MachineVision_Lab/Machine_Vision_Lab_Manual_FILLED.docx
@@ -2984,12 +2984,10 @@
       </w:pPr>
       <w:r>
         <w:rPr>
-          <w:i/>
-          <w:iCs/>
-          <w:sz w:val="22"/>
-          <w:szCs w:val="22"/>
-        </w:rPr>
-        <w:t xml:space="preserve">Students should write the observed dimensions/class of the chosen image and summarize their understanding of the basic MATLAB/SCILAB image I/O workflow.</w:t>
+          <w:rFonts w:ascii="Calibri" w:hAnsi="Calibri"/>
+          <w:i w:val="0"/>
+        </w:rPr>
+        <w:t>The input image was read successfully and its size (256 x 256) and class (uint8) were displayed in the command window. The image was shown using both imshow and imagesc and then saved in a different format with imwrite. This experiment established the basic MATLAB image I/O workflow - reading an image into a matrix, displaying it and writing it back to disk - which is the foundation for all further image-processing work.</w:t>
       </w:r>
     </w:p>
     <w:p>
@@ -5229,12 +5227,10 @@
       </w:pPr>
       <w:r>
         <w:rPr>
-          <w:i/>
-          <w:iCs/>
-          <w:sz w:val="22"/>
-          <w:szCs w:val="22"/>
-        </w:rPr>
-        <w:t xml:space="preserve">Students should note the file-size differences among PNG, JPEG and BMP for the same image and relate this to lossless vs lossy compression.</w:t>
+          <w:rFonts w:ascii="Calibri" w:hAnsi="Calibri"/>
+          <w:i w:val="0"/>
+        </w:rPr>
+        <w:t>The same image was converted into RGB, grayscale, binary and indexed forms, and the class of each was verified in the command window. When saved, the JPEG file was clearly smaller than the PNG and BMP files, because JPEG uses lossy compression while PNG and BMP are lossless. We thus understood the four image classes and the trade-off between file size and image quality for different file formats.</w:t>
       </w:r>
     </w:p>
     <w:p>
@@ -7551,12 +7547,10 @@
       </w:pPr>
       <w:r>
         <w:rPr>
-          <w:i/>
-          <w:iCs/>
-          <w:sz w:val="22"/>
-          <w:szCs w:val="22"/>
-        </w:rPr>
-        <w:t xml:space="preserve">Students should describe which operation is most suitable for change detection and which for masking, based on observed results.</w:t>
+          <w:rFonts w:ascii="Calibri" w:hAnsi="Calibri"/>
+          <w:i w:val="0"/>
+        </w:rPr>
+        <w:t>Arithmetic operations changed the brightness and combined two images (addition brightens/blends, subtraction highlights differences), while logical operations worked on binary images. We observed that image subtraction is most suitable for change detection and the AND operation is most suitable for masking (extracting a region of interest). Pixel values were clipped to the 0-255 range whenever a result exceeded the limit.</w:t>
       </w:r>
     </w:p>
     <w:p>
@@ -9730,12 +9724,10 @@
       </w:pPr>
       <w:r>
         <w:rPr>
-          <w:i/>
-          <w:iCs/>
-          <w:sz w:val="22"/>
-          <w:szCs w:val="22"/>
-        </w:rPr>
-        <w:t xml:space="preserve">Students should comment on the visual quality loss/gain with each interpolation method and identify which bit planes are most significant.</w:t>
+          <w:rFonts w:ascii="Calibri" w:hAnsi="Calibri"/>
+          <w:i w:val="0"/>
+        </w:rPr>
+        <w:t>Zooming with bicubic interpolation produced a smoother enlarged image than nearest-neighbour, while shrinking caused a loss of fine detail. Bit-plane slicing showed that the higher-order planes (especially bits 6 and 7) carry most of the visually important information, whereas the lower planes mostly contain fine texture and noise. Hence the most-significant bit planes are the most important for image quality.</w:t>
       </w:r>
     </w:p>
     <w:p>
@@ -11974,12 +11966,10 @@
       </w:pPr>
       <w:r>
         <w:rPr>
-          <w:i/>
-          <w:iCs/>
-          <w:sz w:val="22"/>
-          <w:szCs w:val="22"/>
-        </w:rPr>
-        <w:t xml:space="preserve">Students should relate the choice of gamma value to the type of correction (brightening vs darkening) required and note which transformation best enhanced the given test image.</w:t>
+          <w:rFonts w:ascii="Calibri" w:hAnsi="Calibri"/>
+          <w:i w:val="0"/>
+        </w:rPr>
+        <w:t>The negative transform inverted the intensities, the log transform brightened the dark regions, the power-law transform (gamma = 0.5) brightened the image, and contrast stretching expanded the intensity range. A gamma less than 1 brightens an image while a gamma greater than 1 darkens it. For this low-contrast test image, contrast stretching and the gamma transform gave the best visual enhancement.</w:t>
       </w:r>
     </w:p>
     <w:p>
@@ -14101,12 +14091,10 @@
       </w:pPr>
       <w:r>
         <w:rPr>
-          <w:i/>
-          <w:iCs/>
-          <w:sz w:val="22"/>
-          <w:szCs w:val="22"/>
-        </w:rPr>
-        <w:t xml:space="preserve">Students should compare the equalized and matched histograms with the original and discuss the visual improvement/change achieved in each case.</w:t>
+          <w:rFonts w:ascii="Calibri" w:hAnsi="Calibri"/>
+          <w:i w:val="0"/>
+        </w:rPr>
+        <w:t>The original image had a narrow histogram (low contrast). After equalization the histogram was spread across the full 0-255 range, giving a strong global contrast boost, while histogram matching reshaped the histogram to resemble the reference image. Equalization produced the larger visual improvement for this image, confirming that spreading the gray levels increases contrast.</w:t>
       </w:r>
     </w:p>
     <w:p>
@@ -16241,12 +16229,10 @@
       </w:pPr>
       <w:r>
         <w:rPr>
-          <w:i/>
-          <w:iCs/>
-          <w:sz w:val="22"/>
-          <w:szCs w:val="22"/>
-        </w:rPr>
-        <w:t xml:space="preserve">Students should note the trade-off between noise reduction and edge preservation observed while applying smoothing versus sharpening masks.</w:t>
+          <w:rFonts w:ascii="Calibri" w:hAnsi="Calibri"/>
+          <w:i w:val="0"/>
+        </w:rPr>
+        <w:t>The 3x3 mean filter blurred the image and reduced noise but also softened the edges, whereas the Laplacian mask sharpened the edges and fine detail. This demonstrates the basic trade-off in spatial filtering: smoothing reduces noise at the cost of edge sharpness, while sharpening strengthens edges but can also amplify noise.</w:t>
       </w:r>
     </w:p>
     <w:p>
@@ -18355,12 +18341,10 @@
       </w:pPr>
       <w:r>
         <w:rPr>
-          <w:i/>
-          <w:iCs/>
-          <w:sz w:val="22"/>
-          <w:szCs w:val="22"/>
-        </w:rPr>
-        <w:t xml:space="preserve">Students should relate bright regions in the centered spectrum to smooth areas of the image and outer regions to edges/fine detail, and note why fftshift() and log-scaling are needed for visualization.</w:t>
+          <w:rFonts w:ascii="Calibri" w:hAnsi="Calibri"/>
+          <w:i w:val="0"/>
+        </w:rPr>
+        <w:t>The 1-D DFT showed the frequency content of a single image row, and the 2-D DFT magnitude spectrum showed that most of the energy is concentrated at the centre (low frequencies / smooth areas), with the outer regions representing edges and fine detail. fftshift() was used to bring the zero-frequency (DC) component to the centre, and log-scaling was applied so that the weaker high-frequency values become visible.</w:t>
       </w:r>
     </w:p>
     <w:p>
@@ -20729,12 +20713,10 @@
       </w:pPr>
       <w:r>
         <w:rPr>
-          <w:i/>
-          <w:iCs/>
-          <w:sz w:val="22"/>
-          <w:szCs w:val="22"/>
-        </w:rPr>
-        <w:t xml:space="preserve">Students should compare ringing artifacts across the three low-pass filters and justify why the Gaussian filter is generally preferred in practical applications.</w:t>
+          <w:rFonts w:ascii="Calibri" w:hAnsi="Calibri"/>
+          <w:i w:val="0"/>
+        </w:rPr>
+        <w:t>The low-pass filters smoothed the image and the high-pass filters highlighted the edges. The Ideal filter produced visible ringing artifacts because of its sharp cut-off, the Butterworth filter gave a smoother result, and the Gaussian filter gave the smoothest result with no ringing. The Gaussian filter is therefore preferred in practice, as it avoids ringing while still smoothing the image.</w:t>
       </w:r>
     </w:p>
     <w:p>
@@ -22947,12 +22929,10 @@
       </w:pPr>
       <w:r>
         <w:rPr>
-          <w:i/>
-          <w:iCs/>
-          <w:sz w:val="22"/>
-          <w:szCs w:val="22"/>
-        </w:rPr>
-        <w:t xml:space="preserve">Students should discuss which filter performed better for each noise type and why adaptive filtering outperforms fixed averaging in noise-variable regions.</w:t>
+          <w:rFonts w:ascii="Calibri" w:hAnsi="Calibri"/>
+          <w:i w:val="0"/>
+        </w:rPr>
+        <w:t>Gaussian and salt-and-pepper noise were added to the image and then restored. The arithmetic mean filter reduced the Gaussian noise but blurred the image, while the adaptive filter removed the salt-and-pepper noise much more effectively and preserved the edges. Adaptive filtering outperforms fixed averaging because it adjusts its action to the local image statistics instead of smoothing every region equally.</w:t>
       </w:r>
     </w:p>
     <w:p>
@@ -25191,12 +25171,10 @@
       </w:pPr>
       <w:r>
         <w:rPr>
-          <w:i/>
-          <w:iCs/>
-          <w:sz w:val="22"/>
-          <w:szCs w:val="22"/>
-        </w:rPr>
-        <w:t xml:space="preserve">Students should relate the size/shape of the structuring element used to the degree of change observed, and identify one practical application each for dilation, erosion, opening and closing.</w:t>
+          <w:rFonts w:ascii="Calibri" w:hAnsi="Calibri"/>
+          <w:i w:val="0"/>
+        </w:rPr>
+        <w:t>Dilation enlarged the foreground objects and filled small gaps, erosion shrank them and removed small specks, opening removed small noise while keeping the object size, and closing filled small holes inside the objects. A larger structuring element produced a greater change. Typical applications: dilation - joining broken parts, erosion - removing small noise, opening - cleaning noise, closing - filling holes.</w:t>
       </w:r>
     </w:p>
     <w:p>

</xml_diff>